<commit_message>
Change Fig 2 width parameter
</commit_message>
<xml_diff>
--- a/paper/paper.docx
+++ b/paper/paper.docx
@@ -2622,7 +2622,7 @@
           <wp:inline>
             <wp:extent cx="4770782" cy="2544417"/>
             <wp:effectExtent b="0" l="0" r="0" t="0"/>
-            <wp:docPr descr="Figure 1: Flowchart of functions within the iddoverse package." title="" id="25" name="Picture"/>
+            <wp:docPr descr="Flowchart of functions within the iddoverse package." title="" id="25" name="Picture"/>
             <a:graphic>
               <a:graphicData uri="http://schemas.openxmlformats.org/drawingml/2006/picture">
                 <pic:pic>
@@ -2665,7 +2665,7 @@
         <w:pStyle w:val="ImageCaption"/>
       </w:pPr>
       <w:r>
-        <w:t xml:space="preserve">Figure 1: Flowchart of functions within the</w:t>
+        <w:t xml:space="preserve">Flowchart of functions within the</w:t>
       </w:r>
       <w:r>
         <w:t xml:space="preserve"> </w:t>
@@ -2894,9 +2894,9 @@
       <w:r>
         <w:drawing>
           <wp:inline>
-            <wp:extent cx="1993942" cy="2544417"/>
+            <wp:extent cx="2239290" cy="2857500"/>
             <wp:effectExtent b="0" l="0" r="0" t="0"/>
-            <wp:docPr descr="Figure 2: Hierarchy of best choice results/events/findings in prepare_domain(). STRESN or DECOD would be used in the first instance and, where rows are missing this information, they are populated with the variables under them in order. The two letter domain code preceeds these variable names." title="" id="29" name="Picture"/>
+            <wp:docPr descr="Hierarchy of best choice results/events/findings in prepare_domain(). STRESN or DECOD would be used in the first instance and, where rows are missing this information, they are populated with the variables under them in order. The two letter domain code preceeds these variable names." title="" id="29" name="Picture"/>
             <a:graphic>
               <a:graphicData uri="http://schemas.openxmlformats.org/drawingml/2006/picture">
                 <pic:pic>
@@ -2915,7 +2915,7 @@
                   <pic:spPr bwMode="auto">
                     <a:xfrm>
                       <a:off x="0" y="0"/>
-                      <a:ext cx="1993942" cy="2544417"/>
+                      <a:ext cx="2239290" cy="2857500"/>
                     </a:xfrm>
                     <a:prstGeom prst="rect">
                       <a:avLst/>
@@ -2939,7 +2939,7 @@
         <w:pStyle w:val="ImageCaption"/>
       </w:pPr>
       <w:r>
-        <w:t xml:space="preserve">Figure 2: Hierarchy of best choice results/events/findings in</w:t>
+        <w:t xml:space="preserve">Hierarchy of best choice results/events/findings in</w:t>
       </w:r>
       <w:r>
         <w:t xml:space="preserve"> </w:t>

</xml_diff>